<commit_message>
Update Financial Quantification with actual recovery amounts; fix slide overflow
- Replace generic framework with Rs. 70,000 (leave encashment) and
  approx. Rs. 150,000 (LWP deduction) recovery table
- Add overflow:hidden to slides; tighten closing slide spacing

https://claude.ai/code/session_018jnFMyvg8WC646r9iXF3Pw
</commit_message>
<xml_diff>
--- a/Fraud_Assessment_Gamma.docx
+++ b/Fraud_Assessment_Gamma.docx
@@ -2714,56 +2714,207 @@
         <w:spacing w:after="80"/>
       </w:pPr>
       <w:r>
-        <w:t>Full quantification is pending payroll data. The preliminary framework covers:</w:t>
+        <w:t>Recoverable amounts calculated based on entitled leave encashment and treatment of late arrivals:</w:t>
       </w:r>
     </w:p>
+    <w:tbl>
+      <w:tblPr>
+        <w:tblStyle w:val="TableGrid"/>
+        <w:tblW w:type="auto" w:w="0"/>
+        <w:tblLayout w:type="fixed"/>
+        <w:tblLook w:firstColumn="1" w:firstRow="1" w:lastColumn="0" w:lastRow="0" w:noHBand="0" w:noVBand="1" w:val="04A0"/>
+      </w:tblPr>
+      <w:tblGrid>
+        <w:gridCol w:w="2551"/>
+        <w:gridCol w:w="3969"/>
+        <w:gridCol w:w="1984"/>
+      </w:tblGrid>
+      <w:tr>
+        <w:tc>
+          <w:tcPr>
+            <w:tcW w:type="dxa" w:w="3135"/>
+            <w:shd w:val="clear" w:color="auto" w:fill="2C3E7A"/>
+          </w:tcPr>
+          <w:p>
+            <w:r>
+              <w:rPr>
+                <w:b/>
+                <w:color w:val="FFFFFF"/>
+                <w:sz w:val="18"/>
+              </w:rPr>
+              <w:t>Head</w:t>
+            </w:r>
+          </w:p>
+        </w:tc>
+        <w:tc>
+          <w:tcPr>
+            <w:tcW w:type="dxa" w:w="3135"/>
+            <w:shd w:val="clear" w:color="auto" w:fill="2C3E7A"/>
+          </w:tcPr>
+          <w:p>
+            <w:r>
+              <w:rPr>
+                <w:b/>
+                <w:color w:val="FFFFFF"/>
+                <w:sz w:val="18"/>
+              </w:rPr>
+              <w:t>Basis</w:t>
+            </w:r>
+          </w:p>
+        </w:tc>
+        <w:tc>
+          <w:tcPr>
+            <w:tcW w:type="dxa" w:w="3135"/>
+            <w:shd w:val="clear" w:color="auto" w:fill="2C3E7A"/>
+          </w:tcPr>
+          <w:p>
+            <w:r>
+              <w:rPr>
+                <w:b/>
+                <w:color w:val="FFFFFF"/>
+                <w:sz w:val="18"/>
+              </w:rPr>
+              <w:t>Amount</w:t>
+            </w:r>
+          </w:p>
+        </w:tc>
+      </w:tr>
+      <w:tr>
+        <w:tc>
+          <w:tcPr>
+            <w:tcW w:type="dxa" w:w="3135"/>
+            <w:shd w:val="clear" w:color="auto" w:fill="F2F5FA"/>
+          </w:tcPr>
+          <w:p>
+            <w:r>
+              <w:rPr>
+                <w:sz w:val="17"/>
+              </w:rPr>
+              <w:t>Leave Encashment</w:t>
+            </w:r>
+          </w:p>
+        </w:tc>
+        <w:tc>
+          <w:tcPr>
+            <w:tcW w:type="dxa" w:w="3135"/>
+            <w:shd w:val="clear" w:color="auto" w:fill="F2F5FA"/>
+          </w:tcPr>
+          <w:p>
+            <w:r>
+              <w:rPr>
+                <w:sz w:val="17"/>
+              </w:rPr>
+              <w:t>Recoverable amount based on entitled leave encashment</w:t>
+            </w:r>
+          </w:p>
+        </w:tc>
+        <w:tc>
+          <w:tcPr>
+            <w:tcW w:type="dxa" w:w="3135"/>
+            <w:shd w:val="clear" w:color="auto" w:fill="F2F5FA"/>
+          </w:tcPr>
+          <w:p>
+            <w:r>
+              <w:rPr>
+                <w:sz w:val="17"/>
+              </w:rPr>
+              <w:t>Rs. 70,000</w:t>
+            </w:r>
+          </w:p>
+        </w:tc>
+      </w:tr>
+      <w:tr>
+        <w:tc>
+          <w:tcPr>
+            <w:tcW w:type="dxa" w:w="3135"/>
+            <w:shd w:val="clear" w:color="auto" w:fill="FFFFFF"/>
+          </w:tcPr>
+          <w:p>
+            <w:r>
+              <w:rPr>
+                <w:sz w:val="17"/>
+              </w:rPr>
+              <w:t>Late Arrival Deduction</w:t>
+            </w:r>
+          </w:p>
+        </w:tc>
+        <w:tc>
+          <w:tcPr>
+            <w:tcW w:type="dxa" w:w="3135"/>
+            <w:shd w:val="clear" w:color="auto" w:fill="FFFFFF"/>
+          </w:tcPr>
+          <w:p>
+            <w:r>
+              <w:rPr>
+                <w:sz w:val="17"/>
+              </w:rPr>
+              <w:t>Excessive late arrivals treated as Leave Without Pay (LWP)</w:t>
+            </w:r>
+          </w:p>
+        </w:tc>
+        <w:tc>
+          <w:tcPr>
+            <w:tcW w:type="dxa" w:w="3135"/>
+            <w:shd w:val="clear" w:color="auto" w:fill="FFFFFF"/>
+          </w:tcPr>
+          <w:p>
+            <w:r>
+              <w:rPr>
+                <w:sz w:val="17"/>
+              </w:rPr>
+              <w:t>Approx. Rs. 150,000</w:t>
+            </w:r>
+          </w:p>
+        </w:tc>
+      </w:tr>
+      <w:tr>
+        <w:tc>
+          <w:tcPr>
+            <w:tcW w:type="dxa" w:w="3135"/>
+            <w:shd w:val="clear" w:color="auto" w:fill="F2F5FA"/>
+          </w:tcPr>
+          <w:p>
+            <w:r>
+              <w:rPr>
+                <w:sz w:val="17"/>
+              </w:rPr>
+              <w:t>Total Estimated Recovery</w:t>
+            </w:r>
+          </w:p>
+        </w:tc>
+        <w:tc>
+          <w:tcPr>
+            <w:tcW w:type="dxa" w:w="3135"/>
+            <w:shd w:val="clear" w:color="auto" w:fill="F2F5FA"/>
+          </w:tcPr>
+          <w:p>
+            <w:r>
+              <w:rPr>
+                <w:sz w:val="17"/>
+              </w:rPr>
+            </w:r>
+          </w:p>
+        </w:tc>
+        <w:tc>
+          <w:tcPr>
+            <w:tcW w:type="dxa" w:w="3135"/>
+            <w:shd w:val="clear" w:color="auto" w:fill="F2F5FA"/>
+          </w:tcPr>
+          <w:p>
+            <w:r>
+              <w:rPr>
+                <w:sz w:val="17"/>
+              </w:rPr>
+              <w:t>Approx. Rs. 220,000</w:t>
+            </w:r>
+          </w:p>
+        </w:tc>
+      </w:tr>
+    </w:tbl>
     <w:p>
       <w:pPr>
-        <w:pStyle w:val="ListBullet"/>
-        <w:spacing w:after="60"/>
-      </w:pPr>
-      <w:r>
-        <w:t>Direct Loss: Wages paid for disguised absences/late arrivals across 96 dates</w:t>
-      </w:r>
-    </w:p>
-    <w:p>
-      <w:pPr>
-        <w:pStyle w:val="ListBullet"/>
-        <w:spacing w:after="60"/>
-      </w:pPr>
-      <w:r>
-        <w:t>Benefit Loss: Bonuses or incentives tied to attendance metrics</w:t>
-      </w:r>
-    </w:p>
-    <w:p>
-      <w:pPr>
-        <w:pStyle w:val="ListBullet"/>
-        <w:spacing w:after="60"/>
-      </w:pPr>
-      <w:r>
-        <w:t>Avoided Penalties: Late deductions and sanctions that should have applied</w:t>
-      </w:r>
-    </w:p>
-    <w:p>
-      <w:pPr>
-        <w:pStyle w:val="ListBullet"/>
-        <w:spacing w:after="60"/>
-      </w:pPr>
-      <w:r>
-        <w:t>Indirect Costs: Investigation, remediation, and reputational risk</w:t>
-      </w:r>
-    </w:p>
-    <w:p>
-      <w:pPr>
         <w:spacing w:after="80"/>
       </w:pPr>
-      <w:r>
-        <w:rPr>
-          <w:b w:val="0"/>
-          <w:i/>
-        </w:rPr>
-        <w:t>Status: Not yet quantified — pending payroll data and HR policy review across all 96 suspect dates.</w:t>
-      </w:r>
     </w:p>
     <w:p>
       <w:pPr>

</xml_diff>

<commit_message>
Final concise version — incorporate PPTX data, add closing recommendations
- Tight single-slide-per-step layout; all verbose text removed
- Financial quantification table with Rs. 70,000 + Rs. 150,000 amounts
- Closing slide: show-cause notice issued, subject accepted irregularities,
  forensic audit recommendation, 6 future control/governance recommendations

https://claude.ai/code/session_018jnFMyvg8WC646r9iXF3Pw
</commit_message>
<xml_diff>
--- a/Fraud_Assessment_Gamma.docx
+++ b/Fraud_Assessment_Gamma.docx
@@ -5,7 +5,7 @@
     <w:p>
       <w:pPr>
         <w:pStyle w:val="Heading1"/>
-        <w:spacing w:before="0" w:after="120"/>
+        <w:spacing w:after="120"/>
       </w:pPr>
       <w:r>
         <w:t>Preliminary Fraud Assessment</w:t>
@@ -28,6 +28,10 @@
         <w:spacing w:after="80"/>
       </w:pPr>
       <w:r>
+        <w:rPr>
+          <w:b w:val="0"/>
+          <w:i w:val="0"/>
+        </w:rPr>
         <w:t>Knowledge &amp; Skill (KS) School System  |  Compliance &amp; Risk Division</w:t>
       </w:r>
     </w:p>
@@ -36,6 +40,10 @@
         <w:spacing w:after="80"/>
       </w:pPr>
       <w:r>
+        <w:rPr>
+          <w:b w:val="0"/>
+          <w:i w:val="0"/>
+        </w:rPr>
         <w:t>Northern Operations Hub (400)  |  January 2026</w:t>
       </w:r>
     </w:p>
@@ -43,7 +51,7 @@
       <w:pPr>
         <w:spacing w:before="40" w:after="40"/>
         <w:pBdr>
-          <w:bottom w:val="single" w:sz="6" w:space="1" w:color="AAAAAA"/>
+          <w:bottom w:val="single" w:sz="4" w:space="1" w:color="AAAAAA"/>
         </w:pBdr>
       </w:pPr>
     </w:p>
@@ -96,7 +104,7 @@
       <w:pPr>
         <w:spacing w:before="40" w:after="40"/>
         <w:pBdr>
-          <w:bottom w:val="single" w:sz="6" w:space="1" w:color="AAAAAA"/>
+          <w:bottom w:val="single" w:sz="4" w:space="1" w:color="AAAAAA"/>
         </w:pBdr>
       </w:pPr>
     </w:p>
@@ -109,13 +117,13 @@
           <w:b w:val="0"/>
           <w:i/>
         </w:rPr>
-        <w:t>Framework: 7-Point Preliminary Fraud Assessment  ·  Fact Finding Report — C&amp;R Division</w:t>
+        <w:t>7-Point Preliminary Fraud Assessment  ·  C&amp;R Division Fact Finding Report</w:t>
       </w:r>
     </w:p>
     <w:p>
       <w:pPr>
         <w:pStyle w:val="Heading1"/>
-        <w:spacing w:before="0" w:after="120"/>
+        <w:spacing w:after="120"/>
       </w:pPr>
       <w:r>
         <w:t>Step 1 — Situation, Red Flags &amp; Hypothesis</w:t>
@@ -136,7 +144,7 @@
         <w:spacing w:after="60"/>
       </w:pPr>
       <w:r>
-        <w:t>96 suspicious entries detected — Jul 2024 to Nov 2025</w:t>
+        <w:t>96 suspect entries — Jul 2024 to Nov 2025</w:t>
       </w:r>
     </w:p>
     <w:p>
@@ -145,7 +153,7 @@
         <w:spacing w:after="60"/>
       </w:pPr>
       <w:r>
-        <w:t>10 confirmed manipulated entries — Oct to Nov 2025</w:t>
+        <w:t>10 confirmed altered entries — Oct to Nov 2025</w:t>
       </w:r>
     </w:p>
     <w:p>
@@ -180,7 +188,11 @@
         <w:spacing w:after="80"/>
       </w:pPr>
       <w:r>
-        <w:t>The C&amp;R Division at KS School System's Northern Operations Hub (400) detected anomalies in the facial recognition attendance system (ATLAS). The Systems Administrator — custodian of the system — allegedly exploited admin access to back-date and alter his own "Time In" entries to conceal late arrivals and absences.</w:t>
+        <w:rPr>
+          <w:b w:val="0"/>
+          <w:i w:val="0"/>
+        </w:rPr>
+        <w:t>The C&amp;R Division at KS School System's Northern Operations Hub (400) detected anomalies in the ATLAS facial recognition attendance system. The Systems Administrator — system custodian — allegedly exploited admin access to back-date and alter his "Time In" entries, concealing late arrivals and absences.</w:t>
       </w:r>
     </w:p>
     <w:p>
@@ -201,10 +213,10 @@
         <w:rPr>
           <w:b/>
         </w:rPr>
-        <w:t xml:space="preserve">RF-1  |  Direct Observation (SOMOTO):  </w:t>
+        <w:t xml:space="preserve">RF-1  |  SOMOTO (Direct Observation):  </w:t>
       </w:r>
       <w:r>
-        <w:t>Auditor observed Mr. Shakeel routinely arriving late and leaving late, yet his leave balance reflected no corresponding deductions for late arrivals.</w:t>
+        <w:t>Auditor observed routine late arrivals and late departures, yet no corresponding leave deductions were recorded.</w:t>
       </w:r>
     </w:p>
     <w:p>
@@ -216,10 +228,10 @@
         <w:rPr>
           <w:b/>
         </w:rPr>
-        <w:t xml:space="preserve">RF-2  |  Anomalous Attendance Pattern:  </w:t>
+        <w:t xml:space="preserve">RF-2  |  Anomalous Pattern:  </w:t>
       </w:r>
       <w:r>
-        <w:t>96 instances over 17 months (Jul 2024–Nov 2025) where "Time In" was recorded within seconds of the 09:00 threshold — a clustering too precise to be natural and indicative of deliberate manipulation.</w:t>
+        <w:t>96 "Time In" entries over 17 months all fall within seconds of the 09:00 threshold — statistically impossible by chance.</w:t>
       </w:r>
     </w:p>
     <w:p>
@@ -236,7 +248,11 @@
         <w:spacing w:after="80"/>
       </w:pPr>
       <w:r>
-        <w:t>Mr. Shakeel knowingly misused admin access to fabricate and overwrite "Time In" records, concealing habitual late arrivals to avoid salary deductions and disciplinary action — constituting payroll / time-and-attendance fraud.</w:t>
+        <w:rPr>
+          <w:b w:val="0"/>
+          <w:i w:val="0"/>
+        </w:rPr>
+        <w:t>Mr. Shakeel knowingly misused admin access to fabricate "Time In" records, concealing late arrivals to avoid salary deductions and disciplinary action — constituting payroll / time-and-attendance fraud.</w:t>
       </w:r>
     </w:p>
     <w:p>
@@ -254,7 +270,7 @@
         <w:spacing w:after="60"/>
       </w:pPr>
       <w:r>
-        <w:t>System glitch caused missed morning scans; subject corrected records in good faith, unaware that supervisor approval was required.</w:t>
+        <w:t>System glitch caused missed morning scans; corrections made in good faith without knowing supervisor approval was needed.</w:t>
       </w:r>
     </w:p>
     <w:p>
@@ -263,67 +279,13 @@
         <w:spacing w:after="60"/>
       </w:pPr>
       <w:r>
-        <w:t>Subject believed his routine late sittings entitled him to offset late arrivals informally, without knowledge of the formal policy or approval process for such adjustments.</w:t>
+        <w:t>Subject believed late sittings entitled him to offset late arrivals informally, unaware of the formal policy and approval process.</w:t>
       </w:r>
     </w:p>
     <w:p>
       <w:pPr>
-        <w:pStyle w:val="Heading2"/>
-        <w:spacing w:before="200" w:after="80"/>
-      </w:pPr>
-      <w:r>
-        <w:t>Why It Matters</w:t>
-      </w:r>
-    </w:p>
-    <w:p>
-      <w:pPr>
-        <w:pStyle w:val="ListBullet"/>
-        <w:spacing w:after="60"/>
-      </w:pPr>
-      <w:r>
-        <w:t>Undermines integrity of the organization's attendance controls</w:t>
-      </w:r>
-    </w:p>
-    <w:p>
-      <w:pPr>
-        <w:pStyle w:val="ListBullet"/>
-        <w:spacing w:after="60"/>
-      </w:pPr>
-      <w:r>
-        <w:t>Financial loss through unearned pay and avoided deductions</w:t>
-      </w:r>
-    </w:p>
-    <w:p>
-      <w:pPr>
-        <w:pStyle w:val="ListBullet"/>
-        <w:spacing w:after="60"/>
-      </w:pPr>
-      <w:r>
-        <w:t>Abuse of privileged IT role and position of trust</w:t>
-      </w:r>
-    </w:p>
-    <w:p>
-      <w:pPr>
-        <w:pStyle w:val="ListBullet"/>
-        <w:spacing w:after="60"/>
-      </w:pPr>
-      <w:r>
-        <w:t>17-month pattern confirms willful, sustained conduct</w:t>
-      </w:r>
-    </w:p>
-    <w:p>
-      <w:pPr>
-        <w:pStyle w:val="ListBullet"/>
-        <w:spacing w:after="60"/>
-      </w:pPr>
-      <w:r>
-        <w:t>Same privileges could be used to manipulate other employees' records</w:t>
-      </w:r>
-    </w:p>
-    <w:p>
-      <w:pPr>
         <w:pStyle w:val="Heading1"/>
-        <w:spacing w:before="0" w:after="120"/>
+        <w:spacing w:after="120"/>
       </w:pPr>
       <w:r>
         <w:t>Step 2 — Legal Destination &amp; Case Strategy</w:t>
@@ -335,7 +297,7 @@
         <w:spacing w:before="200" w:after="80"/>
       </w:pPr>
       <w:r>
-        <w:t>Legal Destination — Disciplinary Action</w:t>
+        <w:t>Legal Destination — Internal Disciplinary Action</w:t>
       </w:r>
     </w:p>
     <w:p>
@@ -343,7 +305,11 @@
         <w:spacing w:after="80"/>
       </w:pPr>
       <w:r>
-        <w:t>This case is classified as an internal employment disciplinary matter. The subject holds a position of trust as custodian of the attendance system, and the evidence indicates a breach of that trust through unauthorized use of admin privileges to alter official records. The appropriate legal destination is a formal disciplinary proceeding under the organization's HR and employment policies.</w:t>
+        <w:rPr>
+          <w:b w:val="0"/>
+          <w:i w:val="0"/>
+        </w:rPr>
+        <w:t>Classified as an internal employment disciplinary matter. The subject breached the trust placed in his privileged role. A formal disciplinary proceeding under the organization's HR and employment policies is the appropriate legal destination.</w:t>
       </w:r>
     </w:p>
     <w:p>
@@ -382,7 +348,7 @@
         <w:t xml:space="preserve">Breach of Trust:  </w:t>
       </w:r>
       <w:r>
-        <w:t>Abuse of privileged role entrusted to safeguard data integrity</w:t>
+        <w:t>Abuse of data custodian role</w:t>
       </w:r>
     </w:p>
     <w:p>
@@ -397,7 +363,7 @@
         <w:t xml:space="preserve">Policy Violation:  </w:t>
       </w:r>
       <w:r>
-        <w:t>Bypassing approved correction process without supervisor authorization</w:t>
+        <w:t>Corrections made without supervisor authorization</w:t>
       </w:r>
     </w:p>
     <w:p>
@@ -421,7 +387,7 @@
         <w:spacing w:before="200" w:after="80"/>
       </w:pPr>
       <w:r>
-        <w:t>Disciplinary Case Strategy</w:t>
+        <w:t>Case Strategy</w:t>
       </w:r>
     </w:p>
     <w:p>
@@ -436,7 +402,7 @@
         <w:t xml:space="preserve">Immediate:  </w:t>
       </w:r>
       <w:r>
-        <w:t>Preserve all digital evidence and secure system logs</w:t>
+        <w:t>Preserve evidence; secure system logs</w:t>
       </w:r>
     </w:p>
     <w:p>
@@ -451,7 +417,7 @@
         <w:t xml:space="preserve">Short-term:  </w:t>
       </w:r>
       <w:r>
-        <w:t>Issue show-cause notice; obtain subject's written explanation</w:t>
+        <w:t>Issue show-cause notice; obtain written explanation</w:t>
       </w:r>
     </w:p>
     <w:p>
@@ -466,7 +432,7 @@
         <w:t xml:space="preserve">Formal Hearing:  </w:t>
       </w:r>
       <w:r>
-        <w:t>Constitute inquiry committee; present findings and evidence to subject</w:t>
+        <w:t>Constitute inquiry committee; present findings</w:t>
       </w:r>
     </w:p>
     <w:p>
@@ -481,7 +447,7 @@
         <w:t xml:space="preserve">Decision:  </w:t>
       </w:r>
       <w:r>
-        <w:t>Determine penalty based on intent, duration, and financial impact — from written warning to termination</w:t>
+        <w:t>Determine penalty based on intent and financial impact</w:t>
       </w:r>
     </w:p>
     <w:p>
@@ -496,7 +462,7 @@
         <w:t xml:space="preserve">Recovery:  </w:t>
       </w:r>
       <w:r>
-        <w:t>Recover salary/benefit amounts confirmed as improperly obtained</w:t>
+        <w:t>Recover improperly obtained salary/benefit amounts</w:t>
       </w:r>
     </w:p>
     <w:p>
@@ -532,7 +498,7 @@
         <w:spacing w:after="60"/>
       </w:pPr>
       <w:r>
-        <w:t>Was there implicit management tolerance of such adjustments?</w:t>
+        <w:t>Was there any implicit management tolerance?</w:t>
       </w:r>
     </w:p>
     <w:p>
@@ -541,7 +507,7 @@
         <w:spacing w:after="60"/>
       </w:pPr>
       <w:r>
-        <w:t>What is the exact financial value of benefit improperly obtained?</w:t>
+        <w:t>Exact financial value of benefit improperly obtained?</w:t>
       </w:r>
     </w:p>
     <w:p>
@@ -555,53 +521,8 @@
     </w:p>
     <w:p>
       <w:pPr>
-        <w:pStyle w:val="Heading2"/>
-        <w:spacing w:before="200" w:after="80"/>
-      </w:pPr>
-      <w:r>
-        <w:t>Classification</w:t>
-      </w:r>
-    </w:p>
-    <w:p>
-      <w:pPr>
-        <w:pStyle w:val="ListBullet"/>
-        <w:spacing w:after="60"/>
-      </w:pPr>
-      <w:r>
-        <w:t>Disciplinary Misconduct</w:t>
-      </w:r>
-    </w:p>
-    <w:p>
-      <w:pPr>
-        <w:pStyle w:val="ListBullet"/>
-        <w:spacing w:after="60"/>
-      </w:pPr>
-      <w:r>
-        <w:t>Breach of Trust</w:t>
-      </w:r>
-    </w:p>
-    <w:p>
-      <w:pPr>
-        <w:pStyle w:val="ListBullet"/>
-        <w:spacing w:after="60"/>
-      </w:pPr>
-      <w:r>
-        <w:t>Unauthorized System Use</w:t>
-      </w:r>
-    </w:p>
-    <w:p>
-      <w:pPr>
-        <w:pStyle w:val="ListBullet"/>
-        <w:spacing w:after="60"/>
-      </w:pPr>
-      <w:r>
-        <w:t>Attendance Policy Violation</w:t>
-      </w:r>
-    </w:p>
-    <w:p>
-      <w:pPr>
         <w:pStyle w:val="Heading1"/>
-        <w:spacing w:before="0" w:after="120"/>
+        <w:spacing w:after="120"/>
       </w:pPr>
       <w:r>
         <w:t>Step 3 — Scheme Mechanics</w:t>
@@ -621,7 +542,11 @@
         <w:spacing w:after="80"/>
       </w:pPr>
       <w:r>
-        <w:t>No "Time In" recorded in the morning. At departure, subject punched a back-dated "Time In" of ≈08:59–09:00 using admin access.</w:t>
+        <w:rPr>
+          <w:b w:val="0"/>
+          <w:i w:val="0"/>
+        </w:rPr>
+        <w:t>No morning scan. At departure, subject punched a back-dated "Time In" of ≈08:59 via admin access.</w:t>
       </w:r>
     </w:p>
     <w:p>
@@ -650,7 +575,11 @@
         <w:spacing w:after="80"/>
       </w:pPr>
       <w:r>
-        <w:t>A genuine late "Time In" existed (e.g., 09:34 or 10:20). Subject replaced it with an earlier fabricated timestamp (e.g., 08:50) via admin access.</w:t>
+        <w:rPr>
+          <w:b w:val="0"/>
+          <w:i w:val="0"/>
+        </w:rPr>
+        <w:t>Genuine late entry (e.g., 09:34 or 10:20) replaced with fabricated earlier timestamp via admin access.</w:t>
       </w:r>
     </w:p>
     <w:p>
@@ -662,7 +591,7 @@
           <w:b/>
           <w:i w:val="0"/>
         </w:rPr>
-        <w:t>▶  2 confirmed instances — 3 &amp; 24 Oct 2025</w:t>
+        <w:t>▶  2 confirmed instances — Oct 2025</w:t>
       </w:r>
     </w:p>
     <w:p>
@@ -679,7 +608,11 @@
         <w:spacing w:after="80"/>
       </w:pPr>
       <w:r>
-        <w:t>Previous day's attendance not recorded. On the next day, both days' fabricated entries were submitted together.</w:t>
+        <w:rPr>
+          <w:b w:val="0"/>
+          <w:i w:val="0"/>
+        </w:rPr>
+        <w:t>Previous day's absence not recorded. Next day, both days' fabricated entries submitted together.</w:t>
       </w:r>
     </w:p>
     <w:p>
@@ -691,7 +624,7 @@
           <w:b/>
           <w:i w:val="0"/>
         </w:rPr>
-        <w:t>▶  1 confirmed instance — 3 &amp; 4 Nov 2025</w:t>
+        <w:t>▶  1 confirmed instance — Nov 2025</w:t>
       </w:r>
     </w:p>
     <w:p>
@@ -700,7 +633,7 @@
         <w:spacing w:before="200" w:after="80"/>
       </w:pPr>
       <w:r>
-        <w:t>How the Scheme Operated — Step by Step</w:t>
+        <w:t>Step-by-Step</w:t>
       </w:r>
     </w:p>
     <w:p>
@@ -709,7 +642,7 @@
         <w:spacing w:after="60"/>
       </w:pPr>
       <w:r>
-        <w:t>Arrives late or absent — no morning facial scan recorded.</w:t>
+        <w:t>Arrives late or absent — no morning facial scan.</w:t>
       </w:r>
     </w:p>
     <w:p>
@@ -727,7 +660,7 @@
         <w:spacing w:after="60"/>
       </w:pPr>
       <w:r>
-        <w:t>Enters or replaces "Time In" with a fabricated timestamp just before 09:00.</w:t>
+        <w:t>Enters fabricated "Time In" just before 09:00.</w:t>
       </w:r>
     </w:p>
     <w:p>
@@ -736,7 +669,7 @@
         <w:spacing w:after="60"/>
       </w:pPr>
       <w:r>
-        <w:t>Report shows on-time arrival. Late/absence hidden from HR and payroll.</w:t>
+        <w:t>Report shows on-time arrival — late/absence hidden from HR.</w:t>
       </w:r>
     </w:p>
     <w:p>
@@ -745,7 +678,7 @@
         <w:spacing w:after="60"/>
       </w:pPr>
       <w:r>
-        <w:t>Full salary maintained. Deductions and penalties avoided.</w:t>
+        <w:t>Full salary maintained; deductions avoided.</w:t>
       </w:r>
     </w:p>
     <w:p>
@@ -754,7 +687,7 @@
         <w:spacing w:before="200" w:after="80"/>
       </w:pPr>
       <w:r>
-        <w:t>Enabling Control Failures</w:t>
+        <w:t>Control Failures</w:t>
       </w:r>
     </w:p>
     <w:p>
@@ -769,7 +702,7 @@
         <w:t xml:space="preserve">No Segregation of Duties:  </w:t>
       </w:r>
       <w:r>
-        <w:t>IT custodian could modify their own records without independent approval.</w:t>
+        <w:t>IT custodian could modify own records without independent approval.</w:t>
       </w:r>
     </w:p>
     <w:p>
@@ -784,7 +717,7 @@
         <w:t xml:space="preserve">No Audit Alert:  </w:t>
       </w:r>
       <w:r>
-        <w:t>Back-dated entries triggered no automated flag or supervisor notification.</w:t>
+        <w:t>Back-dated entries triggered no automated flag or notification.</w:t>
       </w:r>
     </w:p>
     <w:p>
@@ -799,13 +732,13 @@
         <w:t xml:space="preserve">Unrestricted Admin Access:  </w:t>
       </w:r>
       <w:r>
-        <w:t>Records could be overwritten with no secondary authorization required.</w:t>
+        <w:t>Records overwritten with no secondary authorization required.</w:t>
       </w:r>
     </w:p>
     <w:p>
       <w:pPr>
         <w:pStyle w:val="Heading1"/>
-        <w:spacing w:before="0" w:after="120"/>
+        <w:spacing w:after="120"/>
       </w:pPr>
       <w:r>
         <w:t>Step 4 — Evidence Collection &amp; Procedures</w:t>
@@ -826,7 +759,7 @@
         <w:spacing w:after="60"/>
       </w:pPr>
       <w:r>
-        <w:t>ATLAS Attendance Data: Actual vs. altered "Time In" records Oct–Nov 2025 (Annexures A–G)</w:t>
+        <w:t>ATLAS attendance data — actual vs. altered entries, Oct–Nov 2025 (Annexures A–G)</w:t>
       </w:r>
     </w:p>
     <w:p>
@@ -835,7 +768,7 @@
         <w:spacing w:after="60"/>
       </w:pPr>
       <w:r>
-        <w:t>System Audit Logs: Timestamps of back-dated entry creation/modification</w:t>
+        <w:t>System audit logs — timestamps of modifications</w:t>
       </w:r>
     </w:p>
     <w:p>
@@ -844,7 +777,7 @@
         <w:spacing w:after="60"/>
       </w:pPr>
       <w:r>
-        <w:t>CCTV Footage: Morning arrival footage for 13, 16, 20, 21, 23 Oct and 3, 4 Nov 2025</w:t>
+        <w:t>CCTV footage — 13, 16, 20, 21, 23 Oct &amp; 3, 4 Nov 2025</w:t>
       </w:r>
     </w:p>
     <w:p>
@@ -853,7 +786,7 @@
         <w:spacing w:after="60"/>
       </w:pPr>
       <w:r>
-        <w:t>CCTV Comparator: Colleague arrival times vs. ATLAS to validate ~3–4 min system offset</w:t>
+        <w:t>CCTV comparator — colleague times vs. ATLAS (~3–4 min system offset)</w:t>
       </w:r>
     </w:p>
     <w:p>
@@ -862,7 +795,7 @@
         <w:spacing w:after="60"/>
       </w:pPr>
       <w:r>
-        <w:t>Historical Data: 96-instance dataset Jul 2024–Nov 2025 (Annexure H)</w:t>
+        <w:t>Historical dataset — 96 instances Jul 2024–Nov 2025 (Annexure H)</w:t>
       </w:r>
     </w:p>
     <w:p>
@@ -871,7 +804,7 @@
         <w:spacing w:after="60"/>
       </w:pPr>
       <w:r>
-        <w:t>Staff Interviews: Verbal confirmations from admin and IT staff</w:t>
+        <w:t>Staff interviews — verbal confirmations obtained</w:t>
       </w:r>
     </w:p>
     <w:p>
@@ -889,7 +822,7 @@
         <w:spacing w:after="60"/>
       </w:pPr>
       <w:r>
-        <w:t>Full admin modification logs — who changed what, and when</w:t>
+        <w:t>Full admin modification logs — who, what, when</w:t>
       </w:r>
     </w:p>
     <w:p>
@@ -916,7 +849,7 @@
         <w:spacing w:after="60"/>
       </w:pPr>
       <w:r>
-        <w:t>HR policy on late attendance deductions and disciplinary thresholds</w:t>
+        <w:t>HR policy on late deductions and thresholds</w:t>
       </w:r>
     </w:p>
     <w:p>
@@ -925,7 +858,7 @@
         <w:spacing w:after="60"/>
       </w:pPr>
       <w:r>
-        <w:t>CCTV review for remaining 85 unverified historical dates</w:t>
+        <w:t>CCTV review for remaining 85 unverified dates</w:t>
       </w:r>
     </w:p>
     <w:p>
@@ -963,10 +896,10 @@
         <w:tblLook w:firstColumn="1" w:firstRow="1" w:lastColumn="0" w:lastRow="0" w:noHBand="0" w:noVBand="1" w:val="04A0"/>
       </w:tblPr>
       <w:tblGrid>
-        <w:gridCol w:w="567"/>
+        <w:gridCol w:w="454"/>
         <w:gridCol w:w="3118"/>
         <w:gridCol w:w="3118"/>
-        <w:gridCol w:w="1701"/>
+        <w:gridCol w:w="1814"/>
       </w:tblGrid>
       <w:tr>
         <w:tc>
@@ -1059,7 +992,7 @@
               <w:rPr>
                 <w:sz w:val="17"/>
               </w:rPr>
-              <w:t>Forensic imaging of ATLAS server database</w:t>
+              <w:t>Forensic image of ATLAS database</w:t>
             </w:r>
           </w:p>
         </w:tc>
@@ -1073,7 +1006,7 @@
               <w:rPr>
                 <w:sz w:val="17"/>
               </w:rPr>
-              <w:t>Preserve tamper-proof evidence</w:t>
+              <w:t>Tamper-proof preservation</w:t>
             </w:r>
           </w:p>
         </w:tc>
@@ -1117,7 +1050,7 @@
               <w:rPr>
                 <w:sz w:val="17"/>
               </w:rPr>
-              <w:t>Extract full system audit log</w:t>
+              <w:t>Extract full admin audit log</w:t>
             </w:r>
           </w:p>
         </w:tc>
@@ -1131,7 +1064,7 @@
               <w:rPr>
                 <w:sz w:val="17"/>
               </w:rPr>
-              <w:t>Establish who changed what and when</w:t>
+              <w:t>Who changed what and when</w:t>
             </w:r>
           </w:p>
         </w:tc>
@@ -1175,7 +1108,7 @@
               <w:rPr>
                 <w:sz w:val="17"/>
               </w:rPr>
-              <w:t>Secure CCTV archive for full period</w:t>
+              <w:t>Secure CCTV archive</w:t>
             </w:r>
           </w:p>
         </w:tc>
@@ -1189,7 +1122,7 @@
               <w:rPr>
                 <w:sz w:val="17"/>
               </w:rPr>
-              <w:t>Prevent overwriting of recordings</w:t>
+              <w:t>Prevent overwriting</w:t>
             </w:r>
           </w:p>
         </w:tc>
@@ -1247,7 +1180,7 @@
               <w:rPr>
                 <w:sz w:val="17"/>
               </w:rPr>
-              <w:t>Quantify financial benefit obtained</w:t>
+              <w:t>Quantify financial benefit</w:t>
             </w:r>
           </w:p>
         </w:tc>
@@ -1305,7 +1238,7 @@
               <w:rPr>
                 <w:sz w:val="17"/>
               </w:rPr>
-              <w:t>Corroborate manipulation across full dataset</w:t>
+              <w:t>Full dataset corroboration</w:t>
             </w:r>
           </w:p>
         </w:tc>
@@ -1349,7 +1282,7 @@
               <w:rPr>
                 <w:sz w:val="17"/>
               </w:rPr>
-              <w:t>Independent IT forensic expert review</w:t>
+              <w:t>Independent IT forensic review</w:t>
             </w:r>
           </w:p>
         </w:tc>
@@ -1363,7 +1296,7 @@
               <w:rPr>
                 <w:sz w:val="17"/>
               </w:rPr>
-              <w:t>Third-party audit trail validation</w:t>
+              <w:t>Third-party validation</w:t>
             </w:r>
           </w:p>
         </w:tc>
@@ -1382,122 +1315,6 @@
           </w:p>
         </w:tc>
       </w:tr>
-      <w:tr>
-        <w:tc>
-          <w:tcPr>
-            <w:tcW w:type="dxa" w:w="2351"/>
-            <w:shd w:val="clear" w:color="auto" w:fill="F2F5FA"/>
-          </w:tcPr>
-          <w:p>
-            <w:r>
-              <w:rPr>
-                <w:sz w:val="17"/>
-              </w:rPr>
-              <w:t>7</w:t>
-            </w:r>
-          </w:p>
-        </w:tc>
-        <w:tc>
-          <w:tcPr>
-            <w:tcW w:type="dxa" w:w="2351"/>
-            <w:shd w:val="clear" w:color="auto" w:fill="F2F5FA"/>
-          </w:tcPr>
-          <w:p>
-            <w:r>
-              <w:rPr>
-                <w:sz w:val="17"/>
-              </w:rPr>
-              <w:t>HR file review for prior warnings</w:t>
-            </w:r>
-          </w:p>
-        </w:tc>
-        <w:tc>
-          <w:tcPr>
-            <w:tcW w:type="dxa" w:w="2351"/>
-            <w:shd w:val="clear" w:color="auto" w:fill="F2F5FA"/>
-          </w:tcPr>
-          <w:p>
-            <w:r>
-              <w:rPr>
-                <w:sz w:val="17"/>
-              </w:rPr>
-              <w:t>Establish recurrence and prior knowledge</w:t>
-            </w:r>
-          </w:p>
-        </w:tc>
-        <w:tc>
-          <w:tcPr>
-            <w:tcW w:type="dxa" w:w="2351"/>
-            <w:shd w:val="clear" w:color="auto" w:fill="F2F5FA"/>
-          </w:tcPr>
-          <w:p>
-            <w:r>
-              <w:rPr>
-                <w:sz w:val="17"/>
-              </w:rPr>
-              <w:t>Medium-term</w:t>
-            </w:r>
-          </w:p>
-        </w:tc>
-      </w:tr>
-      <w:tr>
-        <w:tc>
-          <w:tcPr>
-            <w:tcW w:type="dxa" w:w="2351"/>
-            <w:shd w:val="clear" w:color="auto" w:fill="FFFFFF"/>
-          </w:tcPr>
-          <w:p>
-            <w:r>
-              <w:rPr>
-                <w:sz w:val="17"/>
-              </w:rPr>
-              <w:t>8</w:t>
-            </w:r>
-          </w:p>
-        </w:tc>
-        <w:tc>
-          <w:tcPr>
-            <w:tcW w:type="dxa" w:w="2351"/>
-            <w:shd w:val="clear" w:color="auto" w:fill="FFFFFF"/>
-          </w:tcPr>
-          <w:p>
-            <w:r>
-              <w:rPr>
-                <w:sz w:val="17"/>
-              </w:rPr>
-              <w:t>Formal written statement from subject</w:t>
-            </w:r>
-          </w:p>
-        </w:tc>
-        <w:tc>
-          <w:tcPr>
-            <w:tcW w:type="dxa" w:w="2351"/>
-            <w:shd w:val="clear" w:color="auto" w:fill="FFFFFF"/>
-          </w:tcPr>
-          <w:p>
-            <w:r>
-              <w:rPr>
-                <w:sz w:val="17"/>
-              </w:rPr>
-              <w:t>Document subject's explanation or defence</w:t>
-            </w:r>
-          </w:p>
-        </w:tc>
-        <w:tc>
-          <w:tcPr>
-            <w:tcW w:type="dxa" w:w="2351"/>
-            <w:shd w:val="clear" w:color="auto" w:fill="FFFFFF"/>
-          </w:tcPr>
-          <w:p>
-            <w:r>
-              <w:rPr>
-                <w:sz w:val="17"/>
-              </w:rPr>
-              <w:t>Medium-term</w:t>
-            </w:r>
-          </w:p>
-        </w:tc>
-      </w:tr>
     </w:tbl>
     <w:p>
       <w:pPr>
@@ -1507,7 +1324,7 @@
     <w:p>
       <w:pPr>
         <w:pStyle w:val="Heading1"/>
-        <w:spacing w:before="0" w:after="120"/>
+        <w:spacing w:after="120"/>
       </w:pPr>
       <w:r>
         <w:t>Step 5 — Interviews &amp; Statements</w:t>
@@ -1528,7 +1345,7 @@
         <w:spacing w:after="60"/>
       </w:pPr>
       <w:r>
-        <w:t>Discussions held with administrative and IT staff at Northern Operations Hub</w:t>
+        <w:t>Administrative and IT staff at Northern Operations Hub</w:t>
       </w:r>
     </w:p>
     <w:p>
@@ -1537,7 +1354,7 @@
         <w:spacing w:after="60"/>
       </w:pPr>
       <w:r>
-        <w:t>Purpose: establish facts on attendance discrepancies and system admin practices</w:t>
+        <w:t>Purpose: verify attendance discrepancies and system admin practices</w:t>
       </w:r>
     </w:p>
     <w:p>
@@ -1547,15 +1364,6 @@
       </w:pPr>
       <w:r>
         <w:t>Verbal confirmations obtained where documentation was absent</w:t>
-      </w:r>
-    </w:p>
-    <w:p>
-      <w:pPr>
-        <w:pStyle w:val="ListBullet"/>
-        <w:spacing w:after="60"/>
-      </w:pPr>
-      <w:r>
-        <w:t>Statement details maintained in the case file</w:t>
       </w:r>
     </w:p>
     <w:p>
@@ -1576,7 +1384,7 @@
         <w:spacing w:before="200" w:after="80"/>
       </w:pPr>
       <w:r>
-        <w:t>Interviews Required — Next Phase</w:t>
+        <w:t>Interviews Required</w:t>
       </w:r>
     </w:p>
     <w:tbl>
@@ -1649,7 +1457,7 @@
               <w:rPr>
                 <w:sz w:val="17"/>
               </w:rPr>
-              <w:t>Subject — formal statement, right to respond</w:t>
+              <w:t>Formal statement; right to respond</w:t>
             </w:r>
           </w:p>
         </w:tc>
@@ -1679,7 +1487,7 @@
               <w:rPr>
                 <w:sz w:val="17"/>
               </w:rPr>
-              <w:t>Admin access authorization; awareness of edits</w:t>
+              <w:t>Admin access authorization</w:t>
             </w:r>
           </w:p>
         </w:tc>
@@ -1709,7 +1517,7 @@
               <w:rPr>
                 <w:sz w:val="17"/>
               </w:rPr>
-              <w:t>Payroll processing; attendance discrepancy awareness</w:t>
+              <w:t>Payroll and attendance policy</w:t>
             </w:r>
           </w:p>
         </w:tc>
@@ -1725,7 +1533,7 @@
               <w:rPr>
                 <w:sz w:val="17"/>
               </w:rPr>
-              <w:t>CCTV-identified colleagues</w:t>
+              <w:t>Identified colleagues</w:t>
             </w:r>
           </w:p>
         </w:tc>
@@ -1739,7 +1547,7 @@
               <w:rPr>
                 <w:sz w:val="17"/>
               </w:rPr>
-              <w:t>Corroborate subject absence on specific dates</w:t>
+              <w:t>Corroborate CCTV absence</w:t>
             </w:r>
           </w:p>
         </w:tc>
@@ -1755,7 +1563,7 @@
               <w:rPr>
                 <w:sz w:val="17"/>
               </w:rPr>
-              <w:t>ATLAS Vendor / IT Provider</w:t>
+              <w:t>Hub Head / Line Manager</w:t>
             </w:r>
           </w:p>
         </w:tc>
@@ -1769,36 +1577,6 @@
               <w:rPr>
                 <w:sz w:val="17"/>
               </w:rPr>
-              <w:t>System back-dating capability; log integrity</w:t>
-            </w:r>
-          </w:p>
-        </w:tc>
-      </w:tr>
-      <w:tr>
-        <w:tc>
-          <w:tcPr>
-            <w:tcW w:type="dxa" w:w="4703"/>
-            <w:shd w:val="clear" w:color="auto" w:fill="FFFFFF"/>
-          </w:tcPr>
-          <w:p>
-            <w:r>
-              <w:rPr>
-                <w:sz w:val="17"/>
-              </w:rPr>
-              <w:t>Hub Head / Line Manager</w:t>
-            </w:r>
-          </w:p>
-        </w:tc>
-        <w:tc>
-          <w:tcPr>
-            <w:tcW w:type="dxa" w:w="4703"/>
-            <w:shd w:val="clear" w:color="auto" w:fill="FFFFFF"/>
-          </w:tcPr>
-          <w:p>
-            <w:r>
-              <w:rPr>
-                <w:sz w:val="17"/>
-              </w:rPr>
               <w:t>Workplace patterns; prior complaints</w:t>
             </w:r>
           </w:p>
@@ -1843,7 +1621,7 @@
         <w:spacing w:after="60"/>
       </w:pPr>
       <w:r>
-        <w:t>Why do 96 entries cluster at exactly 08:59–09:00 over 17 months?</w:t>
+        <w:t>Why do 96 entries cluster at 08:59–09:00 over 17 months?</w:t>
       </w:r>
     </w:p>
     <w:p>
@@ -1857,60 +1635,6 @@
     </w:p>
     <w:p>
       <w:pPr>
-        <w:pStyle w:val="ListBullet"/>
-        <w:spacing w:after="60"/>
-      </w:pPr>
-      <w:r>
-        <w:t>Who else knew about your admin access capabilities?</w:t>
-      </w:r>
-    </w:p>
-    <w:p>
-      <w:pPr>
-        <w:pStyle w:val="Heading2"/>
-        <w:spacing w:before="200" w:after="80"/>
-      </w:pPr>
-      <w:r>
-        <w:t>Key Questions — IT / System</w:t>
-      </w:r>
-    </w:p>
-    <w:p>
-      <w:pPr>
-        <w:pStyle w:val="ListBullet"/>
-        <w:spacing w:after="60"/>
-      </w:pPr>
-      <w:r>
-        <w:t>Who granted admin access and under what policy?</w:t>
-      </w:r>
-    </w:p>
-    <w:p>
-      <w:pPr>
-        <w:pStyle w:val="ListBullet"/>
-        <w:spacing w:after="60"/>
-      </w:pPr>
-      <w:r>
-        <w:t>Is there a policy governing attendance record modification?</w:t>
-      </w:r>
-    </w:p>
-    <w:p>
-      <w:pPr>
-        <w:pStyle w:val="ListBullet"/>
-        <w:spacing w:after="60"/>
-      </w:pPr>
-      <w:r>
-        <w:t>Are modifications separately logged with a full audit trail?</w:t>
-      </w:r>
-    </w:p>
-    <w:p>
-      <w:pPr>
-        <w:pStyle w:val="ListBullet"/>
-        <w:spacing w:after="60"/>
-      </w:pPr>
-      <w:r>
-        <w:t>Has anyone else used admin access to alter records?</w:t>
-      </w:r>
-    </w:p>
-    <w:p>
-      <w:pPr>
         <w:pStyle w:val="Heading2"/>
         <w:spacing w:before="200" w:after="80"/>
       </w:pPr>
@@ -1924,7 +1648,7 @@
         <w:spacing w:after="60"/>
       </w:pPr>
       <w:r>
-        <w:t>Interview subject only after all documentary evidence is secured</w:t>
+        <w:t>Interview subject after all evidence is secured</w:t>
       </w:r>
     </w:p>
     <w:p>
@@ -1933,16 +1657,7 @@
         <w:spacing w:after="60"/>
       </w:pPr>
       <w:r>
-        <w:t>Use signed, witnessed statement format</w:t>
-      </w:r>
-    </w:p>
-    <w:p>
-      <w:pPr>
-        <w:pStyle w:val="ListBullet"/>
-        <w:spacing w:after="60"/>
-      </w:pPr>
-      <w:r>
-        <w:t>Present specific dates for direct response</w:t>
+        <w:t>Use signed, witnessed statement format; present specific dates</w:t>
       </w:r>
     </w:p>
     <w:p>
@@ -1960,13 +1675,13 @@
         <w:spacing w:after="60"/>
       </w:pPr>
       <w:r>
-        <w:t>Consult legal counsel before formal subject interview</w:t>
+        <w:t>Consult legal counsel before formal interview</w:t>
       </w:r>
     </w:p>
     <w:p>
       <w:pPr>
         <w:pStyle w:val="Heading1"/>
-        <w:spacing w:before="0" w:after="120"/>
+        <w:spacing w:after="120"/>
       </w:pPr>
       <w:r>
         <w:t>Step 6 — Evidence Analysis &amp; Quantification</w:t>
@@ -1978,61 +1693,7 @@
         <w:spacing w:before="200" w:after="80"/>
       </w:pPr>
       <w:r>
-        <w:t>Key Metrics</w:t>
-      </w:r>
-    </w:p>
-    <w:p>
-      <w:pPr>
-        <w:pStyle w:val="ListBullet"/>
-        <w:spacing w:after="60"/>
-      </w:pPr>
-      <w:r>
-        <w:t>10 confirmed manipulated entries — Oct to Nov 2025</w:t>
-      </w:r>
-    </w:p>
-    <w:p>
-      <w:pPr>
-        <w:pStyle w:val="ListBullet"/>
-        <w:spacing w:after="60"/>
-      </w:pPr>
-      <w:r>
-        <w:t>96 historically suspect entries — Jul 2024 to Nov 2025</w:t>
-      </w:r>
-    </w:p>
-    <w:p>
-      <w:pPr>
-        <w:pStyle w:val="ListBullet"/>
-        <w:spacing w:after="60"/>
-      </w:pPr>
-      <w:r>
-        <w:t>5 instances of CCTV-verified absence vs. system claim</w:t>
-      </w:r>
-    </w:p>
-    <w:p>
-      <w:pPr>
-        <w:pStyle w:val="ListBullet"/>
-        <w:spacing w:after="60"/>
-      </w:pPr>
-      <w:r>
-        <w:t>3–4 minute offset between ATLAS system time and CCTV time</w:t>
-      </w:r>
-    </w:p>
-    <w:p>
-      <w:pPr>
-        <w:pStyle w:val="ListBullet"/>
-        <w:spacing w:after="60"/>
-      </w:pPr>
-      <w:r>
-        <w:t>17+ months duration of the identified pattern</w:t>
-      </w:r>
-    </w:p>
-    <w:p>
-      <w:pPr>
-        <w:pStyle w:val="Heading2"/>
-        <w:spacing w:before="200" w:after="80"/>
-      </w:pPr>
-      <w:r>
-        <w:t>Confirmed Manipulation Cases — Oct to Nov 2025</w:t>
+        <w:t>Confirmed Manipulation Cases — Oct–Nov 2025</w:t>
       </w:r>
     </w:p>
     <w:tbl>
@@ -2044,9 +1705,9 @@
       </w:tblPr>
       <w:tblGrid>
         <w:gridCol w:w="1701"/>
-        <w:gridCol w:w="2551"/>
-        <w:gridCol w:w="2551"/>
-        <w:gridCol w:w="1701"/>
+        <w:gridCol w:w="2268"/>
+        <w:gridCol w:w="2268"/>
+        <w:gridCol w:w="2268"/>
       </w:tblGrid>
       <w:tr>
         <w:tc>
@@ -2109,7 +1770,7 @@
                 <w:color w:val="FFFFFF"/>
                 <w:sz w:val="18"/>
               </w:rPr>
-              <w:t>CCTV Verified</w:t>
+              <w:t>CCTV</w:t>
             </w:r>
           </w:p>
         </w:tc>
@@ -2709,14 +2370,6 @@
         <w:t>Financial Quantification</w:t>
       </w:r>
     </w:p>
-    <w:p>
-      <w:pPr>
-        <w:spacing w:after="80"/>
-      </w:pPr>
-      <w:r>
-        <w:t>Recoverable amounts calculated based on entitled leave encashment and treatment of late arrivals:</w:t>
-      </w:r>
-    </w:p>
     <w:tbl>
       <w:tblPr>
         <w:tblStyle w:val="TableGrid"/>
@@ -2922,7 +2575,7 @@
         <w:spacing w:before="200" w:after="80"/>
       </w:pPr>
       <w:r>
-        <w:t>Pattern Analysis — Historical Data Significance</w:t>
+        <w:t>Pattern Significance</w:t>
       </w:r>
     </w:p>
     <w:p>
@@ -2930,13 +2583,17 @@
         <w:spacing w:after="80"/>
       </w:pPr>
       <w:r>
-        <w:t>96 entries falling within a 2-minute window over 17 months cannot occur by chance — confirming deliberate, systematic back-dating targeting the exact 09:00 reporting threshold.</w:t>
+        <w:rPr>
+          <w:b w:val="0"/>
+          <w:i w:val="0"/>
+        </w:rPr>
+        <w:t>96 entries within a 2-minute window over 17 months cannot occur naturally — confirming deliberate, systematic back-dating targeting the exact 09:00 reporting threshold.</w:t>
       </w:r>
     </w:p>
     <w:p>
       <w:pPr>
         <w:pStyle w:val="Heading1"/>
-        <w:spacing w:before="0" w:after="120"/>
+        <w:spacing w:after="120"/>
       </w:pPr>
       <w:r>
         <w:t>Step 7 — Case File, Expert Output &amp; Recovery Support</w:t>
@@ -2966,7 +2623,7 @@
         <w:spacing w:after="60"/>
       </w:pPr>
       <w:r>
-        <w:t>Annexures A–G: Actual vs. altered attendance reports (Oct–Nov 2025)</w:t>
+        <w:t>Annexures A–G: Actual vs. altered records Oct–Nov 2025</w:t>
       </w:r>
     </w:p>
     <w:p>
@@ -2975,7 +2632,7 @@
         <w:spacing w:after="60"/>
       </w:pPr>
       <w:r>
-        <w:t>Annexure H: 96-instance historical pattern data (Jul 2024–Nov 2025)</w:t>
+        <w:t>Annexure H: 96-instance historical pattern Jul 2024–Nov 2025</w:t>
       </w:r>
     </w:p>
     <w:p>
@@ -2993,7 +2650,7 @@
         <w:spacing w:after="60"/>
       </w:pPr>
       <w:r>
-        <w:t>Staff interview notes and verbal confirmations</w:t>
+        <w:t>Interview notes and verbal confirmations</w:t>
       </w:r>
     </w:p>
     <w:p>
@@ -3002,16 +2659,7 @@
         <w:spacing w:after="60"/>
       </w:pPr>
       <w:r>
-        <w:t>ATLAS screenshots — original vs. modified entries</w:t>
-      </w:r>
-    </w:p>
-    <w:p>
-      <w:pPr>
-        <w:pStyle w:val="ListBullet"/>
-        <w:spacing w:after="60"/>
-      </w:pPr>
-      <w:r>
-        <w:t>Inquiry Committee (IC-1) recommended decisions</w:t>
+        <w:t>IC-1 recommended decisions</w:t>
       </w:r>
     </w:p>
     <w:p>
@@ -3029,7 +2677,7 @@
         <w:spacing w:after="60"/>
       </w:pPr>
       <w:r>
-        <w:t>IT Forensic Expert: Validate audit trail integrity; confirm logs untampered; assess full scope of manipulation</w:t>
+        <w:t>IT Forensic Expert: Audit trail integrity; full scope of manipulation</w:t>
       </w:r>
     </w:p>
     <w:p>
@@ -3038,7 +2686,7 @@
         <w:spacing w:after="60"/>
       </w:pPr>
       <w:r>
-        <w:t>Payroll/HR Analyst: Quantify financial benefit obtained across the 17-month period</w:t>
+        <w:t>Payroll/HR Analyst: Quantify benefit across 17-month period</w:t>
       </w:r>
     </w:p>
     <w:p>
@@ -3047,7 +2695,7 @@
         <w:spacing w:after="60"/>
       </w:pPr>
       <w:r>
-        <w:t>Legal Counsel: Disciplinary charge drafting; advice on recovery mechanisms</w:t>
+        <w:t>Legal Counsel: Draft disciplinary charges; recovery advice</w:t>
       </w:r>
     </w:p>
     <w:p>
@@ -3056,7 +2704,7 @@
         <w:spacing w:after="60"/>
       </w:pPr>
       <w:r>
-        <w:t>ATLAS Vendor: Confirm system back-dating capability and log completeness</w:t>
+        <w:t>ATLAS Vendor: Confirm back-dating capability and log completeness</w:t>
       </w:r>
     </w:p>
     <w:p>
@@ -3065,52 +2713,7 @@
         <w:spacing w:before="200" w:after="80"/>
       </w:pPr>
       <w:r>
-        <w:t>Recovery Support</w:t>
-      </w:r>
-    </w:p>
-    <w:p>
-      <w:pPr>
-        <w:pStyle w:val="ListBullet"/>
-        <w:spacing w:after="60"/>
-      </w:pPr>
-      <w:r>
-        <w:t>Financial: Salary/benefit recovery via employment contract provisions</w:t>
-      </w:r>
-    </w:p>
-    <w:p>
-      <w:pPr>
-        <w:pStyle w:val="ListBullet"/>
-        <w:spacing w:after="60"/>
-      </w:pPr>
-      <w:r>
-        <w:t>Disciplinary: IC-1 recommendations implemented through HR processes</w:t>
-      </w:r>
-    </w:p>
-    <w:p>
-      <w:pPr>
-        <w:pStyle w:val="ListBullet"/>
-        <w:spacing w:after="60"/>
-      </w:pPr>
-      <w:r>
-        <w:t>System: Segregation of duties; dual-approval for admin edits; automated audit alerts</w:t>
-      </w:r>
-    </w:p>
-    <w:p>
-      <w:pPr>
-        <w:pStyle w:val="ListBullet"/>
-        <w:spacing w:after="60"/>
-      </w:pPr>
-      <w:r>
-        <w:t>Policy: Restrict self-modification of attendance; mandatory supervisor sign-off for all adjustments</w:t>
-      </w:r>
-    </w:p>
-    <w:p>
-      <w:pPr>
-        <w:pStyle w:val="Heading2"/>
-        <w:spacing w:before="200" w:after="80"/>
-      </w:pPr>
-      <w:r>
-        <w:t>Prioritized Action Plan</w:t>
+        <w:t>Action Plan</w:t>
       </w:r>
     </w:p>
     <w:p>
@@ -3122,10 +2725,10 @@
         <w:rPr>
           <w:b/>
         </w:rPr>
-        <w:t xml:space="preserve">Immediate — Week 1:  </w:t>
+        <w:t xml:space="preserve">Immediate:  </w:t>
       </w:r>
       <w:r>
-        <w:t>Forensic image ATLAS server · Secure all CCTV archives · Preserve all digital evidence</w:t>
+        <w:t>Forensic image ATLAS; secure CCTV archives</w:t>
       </w:r>
     </w:p>
     <w:p>
@@ -3137,10 +2740,10 @@
         <w:rPr>
           <w:b/>
         </w:rPr>
-        <w:t xml:space="preserve">Short-Term — Weeks 2–4:  </w:t>
+        <w:t xml:space="preserve">Weeks 2–4:  </w:t>
       </w:r>
       <w:r>
-        <w:t>CCTV review for all 96 dates · Independent IT forensic report · Obtain full payroll data · Brief legal counsel</w:t>
+        <w:t>CCTV review (96 dates); IT forensic report; payroll data</w:t>
       </w:r>
     </w:p>
     <w:p>
@@ -3152,10 +2755,10 @@
         <w:rPr>
           <w:b/>
         </w:rPr>
-        <w:t xml:space="preserve">Medium-Term — Months 2–3:  </w:t>
+        <w:t xml:space="preserve">Months 2–3:  </w:t>
       </w:r>
       <w:r>
-        <w:t>Formal disciplinary hearing · Quantify total financial loss · Issue charges per IC-1 recommendations</w:t>
+        <w:t>Disciplinary hearing; quantify loss; issue charges</w:t>
       </w:r>
     </w:p>
     <w:p>
@@ -3167,25 +2770,10 @@
         <w:rPr>
           <w:b/>
         </w:rPr>
-        <w:t xml:space="preserve">Parallel Track:  </w:t>
+        <w:t xml:space="preserve">Parallel:  </w:t>
       </w:r>
       <w:r>
-        <w:t>Review all staff records for manipulation by subject · Implement IT control remediation</w:t>
-      </w:r>
-    </w:p>
-    <w:p>
-      <w:pPr>
-        <w:pStyle w:val="ListBullet"/>
-        <w:spacing w:after="60"/>
-      </w:pPr>
-      <w:r>
-        <w:rPr>
-          <w:b/>
-        </w:rPr>
-        <w:t xml:space="preserve">Decision Gate:  </w:t>
-      </w:r>
-      <w:r>
-        <w:t>Assess penalty based on intent, duration, and quantified financial impact</w:t>
+        <w:t>Review other staff records; IT control remediation</w:t>
       </w:r>
     </w:p>
     <w:p>
@@ -3200,25 +2788,43 @@
         <w:t xml:space="preserve">Close-Out:  </w:t>
       </w:r>
       <w:r>
-        <w:t>System-wide control improvements deployed · Attendance policy updated · Recovery action initiated</w:t>
+        <w:t>Policy update; recovery action; system controls deployed</w:t>
       </w:r>
     </w:p>
     <w:p>
       <w:pPr>
-        <w:pStyle w:val="Heading1"/>
-        <w:spacing w:before="0" w:after="120"/>
+        <w:pStyle w:val="Heading2"/>
+        <w:spacing w:before="200" w:after="80"/>
       </w:pPr>
       <w:r>
-        <w:t>Overall Assessment &amp; Recommendation</w:t>
+        <w:t>Recovery &amp; Risk</w:t>
       </w:r>
     </w:p>
     <w:p>
       <w:pPr>
-        <w:pStyle w:val="Heading2"/>
-        <w:spacing w:before="200" w:after="80"/>
+        <w:pStyle w:val="ListBullet"/>
+        <w:spacing w:after="60"/>
       </w:pPr>
       <w:r>
-        <w:t>Is Further Investigation Justified?</w:t>
+        <w:t>Financial recovery — approx. Rs. 220,000 via employment contract</w:t>
+      </w:r>
+    </w:p>
+    <w:p>
+      <w:pPr>
+        <w:pStyle w:val="ListBullet"/>
+        <w:spacing w:after="60"/>
+      </w:pPr>
+      <w:r>
+        <w:t>IC-1 disciplinary recommendations implemented through HR</w:t>
+      </w:r>
+    </w:p>
+    <w:p>
+      <w:pPr>
+        <w:pStyle w:val="ListBullet"/>
+        <w:spacing w:after="60"/>
+      </w:pPr>
+      <w:r>
+        <w:t>Segregation of duties; dual-approval for admin edits; automated audit alerts</w:t>
       </w:r>
     </w:p>
     <w:p>
@@ -3230,15 +2836,64 @@
           <w:b/>
           <w:i w:val="0"/>
         </w:rPr>
-        <w:t>YES — Strongly Recommended</w:t>
+        <w:t>Risk Rating: HIGH — Clear evidence, long-term pattern, deliberate method, unique privileged access.</w:t>
       </w:r>
     </w:p>
     <w:p>
       <w:pPr>
+        <w:pStyle w:val="Heading1"/>
+        <w:spacing w:after="120"/>
+      </w:pPr>
+      <w:r>
+        <w:t>Overall Assessment &amp; Recommendations</w:t>
+      </w:r>
+    </w:p>
+    <w:p>
+      <w:pPr>
+        <w:pStyle w:val="Heading2"/>
+        <w:spacing w:before="200" w:after="80"/>
+      </w:pPr>
+      <w:r>
+        <w:t>Assessment</w:t>
+      </w:r>
+    </w:p>
+    <w:p>
+      <w:pPr>
         <w:spacing w:after="80"/>
       </w:pPr>
       <w:r>
-        <w:t>10 confirmed manipulated entries with documentary proof, 5 CCTV-corroborated dates, a statistically anomalous 17-month pattern of 96 suspect entries, and the subject's unique privileged access all meet the threshold for full formal investigation and disciplinary proceedings.</w:t>
+        <w:rPr>
+          <w:b/>
+          <w:i w:val="0"/>
+        </w:rPr>
+        <w:t>Further Investigation — Strongly Recommended</w:t>
+      </w:r>
+    </w:p>
+    <w:p>
+      <w:pPr>
+        <w:pStyle w:val="ListBullet"/>
+        <w:spacing w:after="60"/>
+      </w:pPr>
+      <w:r>
+        <w:t>Preliminary findings indicate a sustained pattern of attendance record manipulation through misuse of administrative access rights.</w:t>
+      </w:r>
+    </w:p>
+    <w:p>
+      <w:pPr>
+        <w:pStyle w:val="ListBullet"/>
+        <w:spacing w:after="60"/>
+      </w:pPr>
+      <w:r>
+        <w:t>A show-cause notice was issued to Mr. Shakeel. His submitted response reflected acceptance of the identified irregularities.</w:t>
+      </w:r>
+    </w:p>
+    <w:p>
+      <w:pPr>
+        <w:pStyle w:val="ListBullet"/>
+        <w:spacing w:after="60"/>
+      </w:pPr>
+      <w:r>
+        <w:t>A detailed forensic audit is recommended to substantiate findings, identify full extent of manipulation, evaluate possible involvement of other parties, and quantify complete financial impact.</w:t>
       </w:r>
     </w:p>
     <w:p>
@@ -3256,7 +2911,7 @@
         <w:spacing w:after="60"/>
       </w:pPr>
       <w:r>
-        <w:t>Total financial value of benefit obtained</w:t>
+        <w:t>Full extent of manipulation across 17-month dataset</w:t>
       </w:r>
     </w:p>
     <w:p>
@@ -3265,7 +2920,7 @@
         <w:spacing w:after="60"/>
       </w:pPr>
       <w:r>
-        <w:t>Whether manipulation extends to other employees' records</w:t>
+        <w:t>Possible involvement of other parties</w:t>
       </w:r>
     </w:p>
     <w:p>
@@ -3274,7 +2929,7 @@
         <w:spacing w:after="60"/>
       </w:pPr>
       <w:r>
-        <w:t>Full integrity of system audit logs — forensic review needed</w:t>
+        <w:t>Complete financial impact beyond the estimated Rs. 220,000</w:t>
       </w:r>
     </w:p>
     <w:p>
@@ -3283,7 +2938,7 @@
         <w:spacing w:after="60"/>
       </w:pPr>
       <w:r>
-        <w:t>Subject's formal explanation or defence</w:t>
+        <w:t>Full integrity of system audit logs — forensic review pending</w:t>
       </w:r>
     </w:p>
     <w:p>
@@ -3297,49 +2952,47 @@
     </w:p>
     <w:p>
       <w:pPr>
-        <w:pStyle w:val="ListBullet"/>
-        <w:spacing w:after="60"/>
+        <w:pStyle w:val="Heading2"/>
+        <w:spacing w:before="200" w:after="80"/>
       </w:pPr>
       <w:r>
-        <w:t>Status of IC-1 disciplinary recommendations</w:t>
+        <w:t>Future Control &amp; Governance Recommendations</w:t>
       </w:r>
     </w:p>
     <w:p>
       <w:pPr>
-        <w:pStyle w:val="Heading2"/>
-        <w:spacing w:before="200" w:after="80"/>
+        <w:pStyle w:val="ListBullet"/>
+        <w:spacing w:after="60"/>
       </w:pPr>
       <w:r>
-        <w:t>Fraud Risk Rating</w:t>
+        <w:t>Implement a complete approval workflow for attendance adjustments with documented justification and digital approval trail.</w:t>
       </w:r>
     </w:p>
     <w:p>
       <w:pPr>
-        <w:spacing w:after="80"/>
+        <w:pStyle w:val="ListBullet"/>
+        <w:spacing w:after="60"/>
       </w:pPr>
       <w:r>
-        <w:rPr>
-          <w:b/>
-          <w:i w:val="0"/>
-        </w:rPr>
-        <w:t>HIGH</w:t>
+        <w:t>Strengthen approval hierarchy by restricting back-date access and enforcing multi-level authorization for attendance amendments.</w:t>
       </w:r>
     </w:p>
     <w:p>
       <w:pPr>
-        <w:spacing w:after="80"/>
+        <w:pStyle w:val="ListBullet"/>
+        <w:spacing w:after="60"/>
       </w:pPr>
       <w:r>
-        <w:t>Clear evidence, long-term pattern, deliberate method, unique privileged access.</w:t>
+        <w:t>Maintain detailed audit trails for all attendance edits — including user ID, date, time, and change history.</w:t>
       </w:r>
     </w:p>
     <w:p>
       <w:pPr>
-        <w:pStyle w:val="Heading2"/>
-        <w:spacing w:before="200" w:after="80"/>
+        <w:pStyle w:val="ListBullet"/>
+        <w:spacing w:after="60"/>
       </w:pPr>
       <w:r>
-        <w:t>Classification</w:t>
+        <w:t>Introduce automated exception reports for unusual attendance patterns and repeated manual overrides.</w:t>
       </w:r>
     </w:p>
     <w:p>
@@ -3348,7 +3001,7 @@
         <w:spacing w:after="60"/>
       </w:pPr>
       <w:r>
-        <w:t>Disciplinary Misconduct</w:t>
+        <w:t>Segregate system administration rights from attendance approval authority to minimize misuse of power.</w:t>
       </w:r>
     </w:p>
     <w:p>
@@ -3357,86 +3010,14 @@
         <w:spacing w:after="60"/>
       </w:pPr>
       <w:r>
-        <w:t>Breach of Trust</w:t>
+        <w:t>Conduct periodic compliance reviews and independent audits of attendance system activities.</w:t>
       </w:r>
     </w:p>
     <w:p>
       <w:pPr>
-        <w:pStyle w:val="ListBullet"/>
-        <w:spacing w:after="60"/>
-      </w:pPr>
-      <w:r>
-        <w:t>Unauthorized System Use</w:t>
-      </w:r>
-    </w:p>
-    <w:p>
-      <w:pPr>
-        <w:pStyle w:val="ListBullet"/>
-        <w:spacing w:after="60"/>
-      </w:pPr>
-      <w:r>
-        <w:t>Attendance Policy Violation</w:t>
-      </w:r>
-    </w:p>
-    <w:p>
-      <w:pPr>
-        <w:pStyle w:val="Heading2"/>
-        <w:spacing w:before="200" w:after="80"/>
-      </w:pPr>
-      <w:r>
-        <w:t>Immediate Actions</w:t>
-      </w:r>
-    </w:p>
-    <w:p>
-      <w:pPr>
-        <w:pStyle w:val="ListBullet"/>
-        <w:spacing w:after="60"/>
-      </w:pPr>
-      <w:r>
-        <w:t>Forensic image ATLAS server</w:t>
-      </w:r>
-    </w:p>
-    <w:p>
-      <w:pPr>
-        <w:pStyle w:val="ListBullet"/>
-        <w:spacing w:after="60"/>
-      </w:pPr>
-      <w:r>
-        <w:t>Secure all CCTV archives</w:t>
-      </w:r>
-    </w:p>
-    <w:p>
-      <w:pPr>
-        <w:pStyle w:val="ListBullet"/>
-        <w:spacing w:after="60"/>
-      </w:pPr>
-      <w:r>
-        <w:t>Issue show-cause notice to subject</w:t>
-      </w:r>
-    </w:p>
-    <w:p>
-      <w:pPr>
-        <w:pStyle w:val="ListBullet"/>
-        <w:spacing w:after="60"/>
-      </w:pPr>
-      <w:r>
-        <w:t>Engage legal counsel</w:t>
-      </w:r>
-    </w:p>
-    <w:p>
-      <w:pPr>
-        <w:pStyle w:val="ListBullet"/>
-        <w:spacing w:after="60"/>
-      </w:pPr>
-      <w:r>
-        <w:t>Proceed to formal disciplinary hearing</w:t>
-      </w:r>
-    </w:p>
-    <w:p>
-      <w:pPr>
         <w:spacing w:before="40" w:after="40"/>
         <w:pBdr>
-          <w:bottom w:val="single" w:sz="6" w:space="1" w:color="AAAAAA"/>
+          <w:bottom w:val="single" w:sz="4" w:space="1" w:color="AAAAAA"/>
         </w:pBdr>
       </w:pPr>
     </w:p>

</xml_diff>

<commit_message>
Step 5: add show-cause notice and Mr. Shakeel's acceptance of misappropriation
https://claude.ai/code/session_018jnFMyvg8WC646r9iXF3Pw
</commit_message>
<xml_diff>
--- a/Fraud_Assessment_Gamma.docx
+++ b/Fraud_Assessment_Gamma.docx
@@ -1336,7 +1336,7 @@
         <w:spacing w:before="200" w:after="80"/>
       </w:pPr>
       <w:r>
-        <w:t>Interviews Conducted</w:t>
+        <w:t>Interviews &amp; Statements</w:t>
       </w:r>
     </w:p>
     <w:p>
@@ -1368,14 +1368,38 @@
     </w:p>
     <w:p>
       <w:pPr>
-        <w:spacing w:after="80"/>
+        <w:pStyle w:val="Heading2"/>
+        <w:spacing w:before="200" w:after="80"/>
       </w:pPr>
       <w:r>
-        <w:rPr>
-          <w:b w:val="0"/>
-          <w:i/>
-        </w:rPr>
-        <w:t>Mr. Shakeel has not yet provided a formal written statement responding to the specific findings in this report.</w:t>
+        <w:t>Show-Cause Notice &amp; Response</w:t>
+      </w:r>
+    </w:p>
+    <w:p>
+      <w:pPr>
+        <w:pStyle w:val="ListBullet"/>
+        <w:spacing w:after="60"/>
+      </w:pPr>
+      <w:r>
+        <w:t>A formal show-cause notice was issued to Mr. Shakeel citing the identified attendance irregularities.</w:t>
+      </w:r>
+    </w:p>
+    <w:p>
+      <w:pPr>
+        <w:pStyle w:val="ListBullet"/>
+        <w:spacing w:after="60"/>
+      </w:pPr>
+      <w:r>
+        <w:t>Mr. Shakeel submitted a written reply in which he accepted and acknowledged the misappropriation of attendance records.</w:t>
+      </w:r>
+    </w:p>
+    <w:p>
+      <w:pPr>
+        <w:pStyle w:val="ListBullet"/>
+        <w:spacing w:after="60"/>
+      </w:pPr>
+      <w:r>
+        <w:t>His acceptance is on record and constitutes a key piece of evidence supporting the disciplinary case.</w:t>
       </w:r>
     </w:p>
     <w:p>

</xml_diff>

<commit_message>
Add Code of Conduct reference to disciplinary action and case strategy
- Step 2 Case Strategy: Decision bullet now references company's Code of Conduct and HR disciplinary policy
- Closing slide: Added explicit statement that disciplinary action shall be taken in accordance with Code of Conduct
- Same changes applied to Gamma DOCX generator and regenerated output
</commit_message>
<xml_diff>
--- a/Fraud_Assessment_Gamma.docx
+++ b/Fraud_Assessment_Gamma.docx
@@ -447,7 +447,7 @@
         <w:t xml:space="preserve">Decision:  </w:t>
       </w:r>
       <w:r>
-        <w:t>Determine penalty based on intent and financial impact</w:t>
+        <w:t>Penalty to be determined in accordance with the company's Code of Conduct and HR disciplinary policy</w:t>
       </w:r>
     </w:p>
     <w:p>
@@ -462,7 +462,7 @@
         <w:t xml:space="preserve">Recovery:  </w:t>
       </w:r>
       <w:r>
-        <w:t>Recover improperly obtained salary/benefit amounts</w:t>
+        <w:t>Recover improperly obtained salary/benefit amounts via employment contract</w:t>
       </w:r>
     </w:p>
     <w:p>
@@ -2917,6 +2917,15 @@
         <w:spacing w:after="60"/>
       </w:pPr>
       <w:r>
+        <w:t>Any disciplinary action shall be taken strictly in accordance with the company's Code of Conduct and applicable HR policies.</w:t>
+      </w:r>
+    </w:p>
+    <w:p>
+      <w:pPr>
+        <w:pStyle w:val="ListBullet"/>
+        <w:spacing w:after="60"/>
+      </w:pPr>
+      <w:r>
         <w:t>A detailed forensic audit is recommended to substantiate findings, identify full extent of manipulation, evaluate possible involvement of other parties, and quantify complete financial impact.</w:t>
       </w:r>
     </w:p>

</xml_diff>